<commit_message>
Fix station chart sizing in report
</commit_message>
<xml_diff>
--- a/Cyclistic_Case_Study.docx
+++ b/Cyclistic_Case_Study.docx
@@ -807,7 +807,7 @@
       <w:r>
         <w:drawing>
           <wp:inline distT="0" distB="0" distL="0" distR="0">
-            <wp:extent cx="7900000" cy="3590000"/>
+            <wp:extent cx="6100000" cy="2772000"/>
             <wp:effectExtent t="0" r="0" b="0" l="0"/>
             <wp:docPr id="1" name="" descr="" title=""/>
             <wp:cNvGraphicFramePr>
@@ -832,7 +832,7 @@
                   <pic:spPr bwMode="auto">
                     <a:xfrm>
                       <a:off x="0" y="0"/>
-                      <a:ext cx="7900000" cy="3590000"/>
+                      <a:ext cx="6100000" cy="2772000"/>
                     </a:xfrm>
                     <a:prstGeom prst="rect">
                       <a:avLst/>

</xml_diff>